<commit_message>
Refocus Extended Abstract on the submitted video, not the product
Per reviewer feedback: judges assess the AI DigiTeach video itself, not
MagikLayout's internal architecture. Rewrote the abstract around the
actual published video (youtube.com/watch?v=TlBQcG6UVuE) — its
Investigate/Predict/Reason/Repair lesson structure, PdP design
(set induksi/isi kandungan/aktiviti/penutup), and production process.
Removed the deep RAG pipeline/evaluation-gate detail from the previous
draft in favor of a lightweight spec-compliance table. Filled in the
confirmed author name (Mohd Azlan Ab Aziz) from the video's metadata.

Co-Authored-By: Claude Sonnet 5 <noreply@anthropic.com>
</commit_message>
<xml_diff>
--- a/MagikLayout_AI_DigiTeach_Extended_Abstract.docx
+++ b/MagikLayout_AI_DigiTeach_Extended_Abstract.docx
@@ -15,7 +15,7 @@
           <w:sz w:val="28"/>
           <w:szCs w:val="28"/>
         </w:rPr>
-        <w:t xml:space="preserve">MagikLayout: An AI-Guided Debugging Studio for Teaching Java Swing Layout Managers</w:t>
+        <w:t xml:space="preserve">Investigate, Predict, Reason, Repair: An AI-Supported Video Lesson on Java Swing BorderLayout</w:t>
       </w:r>
     </w:p>
     <w:p>
@@ -26,14 +26,10 @@
       <w:r>
         <w:rPr>
           <w:rFonts w:ascii="Times New Roman" w:cs="Times New Roman" w:eastAsia="Times New Roman" w:hAnsi="Times New Roman"/>
-          <w:i/>
-          <w:iCs/>
-          <w:sz w:val="22"/>
-          <w:szCs w:val="22"/>
-          <w:highlight w:val="yellow"/>
-          <w:highlightCs w:val="yellow"/>
-        </w:rPr>
-        <w:t xml:space="preserve">[Author Name]</w:t>
+          <w:sz w:val="22"/>
+          <w:szCs w:val="22"/>
+        </w:rPr>
+        <w:t xml:space="preserve">Mohd Azlan Ab Aziz</w:t>
       </w:r>
       <w:r>
         <w:rPr>
@@ -142,7 +138,41 @@
           <w:sz w:val="22"/>
           <w:szCs w:val="22"/>
         </w:rPr>
-        <w:t xml:space="preserve">The Java-Based Application Development course (Session I, 2026/2027) at the Centre for Instructor and Advanced Skill Training (CIAST), Shah Alam, trains TVET instructor-trainees to build, and later teach, Graphical User Interface (GUI) programming with Java Swing — knowledge these trainees carry forward into their own polytechnic and community-college classrooms. A persistent difficulty in this course, and in the classrooms its graduates go on to run, is that learners can read Java statements without being able to predict the runtime geometry a layout manager will produce: why a second button silently disappears from a BorderLayout region, or why GridLayout ignores a component's preferred size. Conventional drag-and-drop GUI builders hide this cause-and-effect relationship, and a general-purpose AI chatbot can describe the rule in the abstract but has never seen the learner's actual broken component tree. This gap between reading code and predicting behaviour is the problem this innovation addresses. MagikLayout (https://magik-layout.mhdazlan.cc/#/) is a browser-based teaching tool built around this problem, and its AI Debugging Studio is the AI DigiTeach submission described here: a visual repair lab in which the interface itself is the lesson, and a retrieval-grounded, guarded AI coach — never the grader — explains why a repair works.</w:t>
+        <w:t xml:space="preserve">This paper documents </w:t>
+      </w:r>
+      <w:r>
+        <w:rPr>
+          <w:rFonts w:ascii="Times New Roman" w:cs="Times New Roman" w:eastAsia="Times New Roman" w:hAnsi="Times New Roman"/>
+          <w:i/>
+          <w:iCs/>
+          <w:sz w:val="22"/>
+          <w:szCs w:val="22"/>
+        </w:rPr>
+        <w:t xml:space="preserve">“Java Swing BorderLayout | Why Did My Button Disappear?”</w:t>
+      </w:r>
+      <w:r>
+        <w:rPr>
+          <w:rFonts w:ascii="Times New Roman" w:cs="Times New Roman" w:eastAsia="Times New Roman" w:hAnsi="Times New Roman"/>
+          <w:sz w:val="22"/>
+          <w:szCs w:val="22"/>
+        </w:rPr>
+        <w:t xml:space="preserve"> (Mohd Azlan Ab Aziz, channel @MAAA-Dev, 4 minutes 58 seconds, published 21 August 2026, </w:t>
+      </w:r>
+      <w:r>
+        <w:rPr>
+          <w:rFonts w:ascii="Times New Roman" w:cs="Times New Roman" w:eastAsia="Times New Roman" w:hAnsi="Times New Roman"/>
+          <w:sz w:val="22"/>
+          <w:szCs w:val="22"/>
+        </w:rPr>
+        <w:t xml:space="preserve">https://www.youtube.com/watch?v=TlBQcG6UVuE</w:t>
+      </w:r>
+      <w:r>
+        <w:rPr>
+          <w:rFonts w:ascii="Times New Roman" w:cs="Times New Roman" w:eastAsia="Times New Roman" w:hAnsi="Times New Roman"/>
+          <w:sz w:val="22"/>
+          <w:szCs w:val="22"/>
+        </w:rPr>
+        <w:t xml:space="preserve">), a digital teaching video submitted to the AI DigiTeach category of MIPAC TVET 2026. The video teaches one specific, common beginner failure in Java Swing GUI programming — a component silently disappearing from a BorderLayout region — using a deliberate four-step lesson structure the video names on screen: Investigate → Predict → Reason → Repair. The lesson reproduces the bug live in Eclipse, then moves into MagikLayout, an interactive browser-based practice tool, where the presenter predicts the fix before requesting a single hint from an AI learning coach — modelling reasoning-before-answer rather than answer-seeking. This abstract describes the video's lesson design, production process and rationale; it deliberately does not attempt to document the practice tool's internal engineering, since the video itself is the submission being assessed.</w:t>
       </w:r>
     </w:p>
     <w:p>
@@ -166,7 +196,7 @@
           <w:sz w:val="22"/>
           <w:szCs w:val="22"/>
         </w:rPr>
-        <w:t xml:space="preserve">bilingual AI hinting, Java Swing GUI programming, retrieval-augmented generation, TVET instructor training, visual debugging</w:t>
+        <w:t xml:space="preserve">AI-supported learning, BorderLayout, digital teaching video, Java Swing, predict-and-repair pedagogy</w:t>
       </w:r>
     </w:p>
     <w:p>
@@ -195,7 +225,22 @@
           <w:sz w:val="22"/>
           <w:szCs w:val="22"/>
         </w:rPr>
-        <w:t xml:space="preserve">Java Swing remains part of introductory GUI programming in polytechnics and TVET instructor-training institutions, including this course, because it teaches layout computation explicitly rather than hiding it behind a flexbox-style abstraction. Instructor-trainees in this course must not only use BorderLayout, FlowLayout and GridLayout correctly, but must be able to explain the underlying rule clearly enough to teach it to their own future students — a demand conventional teaching materials do not meet.</w:t>
+        <w:t xml:space="preserve">The Java-Based Application Development course (Session I, 2026/2027) at the Centre for Instructor and Advanced Skill Training (CIAST), Shah Alam, includes Java Swing GUI programming, where BorderLayout is typically a learner's first layout manager. A near-universal early failure is this: a learner adds a second button to the SOUTH region of a BorderLayout, runs the program, and one of the two buttons has simply vanished — with no error, no exception, and no obvious reason why. Learners typically resolve this by trial-and-compile, or by asking a generic AI chatbot, which can describe BorderLayout in the abstract but has never seen the learner's actual code or component tree, and so cannot confirm whether a proposed fix is even structurally correct. Neither path builds the mental model needed to predict layout behaviour before running the program — which is the actual skill this course needs learners to leave with.</w:t>
+      </w:r>
+    </w:p>
+    <w:p>
+      <w:pPr>
+        <w:spacing w:after="120" w:before="240"/>
+      </w:pPr>
+      <w:r>
+        <w:rPr>
+          <w:rFonts w:ascii="Times New Roman" w:cs="Times New Roman" w:eastAsia="Times New Roman" w:hAnsi="Times New Roman"/>
+          <w:b/>
+          <w:bCs/>
+          <w:sz w:val="22"/>
+          <w:szCs w:val="22"/>
+        </w:rPr>
+        <w:t xml:space="preserve">2. Innovation Objective</w:t>
       </w:r>
     </w:p>
     <w:p>
@@ -209,36 +254,7 @@
           <w:sz w:val="22"/>
           <w:szCs w:val="22"/>
         </w:rPr>
-        <w:t xml:space="preserve">In practice, learners resolve layout confusion by trial-and-compile: change the code, recompile, observe, repeat. This is slow, does not build a transferable mental model, and gives an instructor no visibility into what a struggling learner actually misunderstands. A general chatbot can be asked for help, but it answers about Swing in the abstract; it cannot see the learner's live component tree, cannot confirm whether a claimed fix is structurally correct, and offers no record an instructor can audit afterward. This is the gap MagikLayout's AI Debugging Studio is built to close: an AI that only speaks once it can point to the exact broken region and the exact retrieved rule behind its answer.</w:t>
-      </w:r>
-    </w:p>
-    <w:p>
-      <w:pPr>
-        <w:spacing w:after="120" w:before="240"/>
-      </w:pPr>
-      <w:r>
-        <w:rPr>
-          <w:rFonts w:ascii="Times New Roman" w:cs="Times New Roman" w:eastAsia="Times New Roman" w:hAnsi="Times New Roman"/>
-          <w:b/>
-          <w:bCs/>
-          <w:sz w:val="22"/>
-          <w:szCs w:val="22"/>
-        </w:rPr>
-        <w:t xml:space="preserve">2. Innovation Objective</w:t>
-      </w:r>
-    </w:p>
-    <w:p>
-      <w:pPr>
-        <w:spacing w:after="160" w:line="276"/>
-        <w:jc w:val="both"/>
-      </w:pPr>
-      <w:r>
-        <w:rPr>
-          <w:rFonts w:ascii="Times New Roman" w:cs="Times New Roman" w:eastAsia="Times New Roman" w:hAnsi="Times New Roman"/>
-          <w:sz w:val="22"/>
-          <w:szCs w:val="22"/>
-        </w:rPr>
-        <w:t xml:space="preserve">The main objective is to produce an AI-integrated digital teaching video, built around the MagikLayout AI Debugging Studio, that models a replicable, evidence-grounded method of teaching Java Swing layout managers. The specific objectives are to:</w:t>
+        <w:t xml:space="preserve">The main objective is to teach the BorderLayout region-collision rule through a video lesson that models investigation and prediction, rather than simply stating the rule. The specific objectives, taken from the video's own stated learning outcomes, are to help the viewer understand:</w:t>
       </w:r>
     </w:p>
     <w:p>
@@ -248,15 +264,15 @@
           <w:ilvl w:val="0"/>
           <w:numId w:val="1"/>
         </w:numPr>
-        <w:spacing w:after="100"/>
-      </w:pPr>
-      <w:r>
-        <w:rPr>
-          <w:rFonts w:ascii="Times New Roman" w:cs="Times New Roman" w:eastAsia="Times New Roman" w:hAnsi="Times New Roman"/>
-          <w:sz w:val="22"/>
-          <w:szCs w:val="22"/>
-        </w:rPr>
-        <w:t xml:space="preserve">demonstrate a visual-first, structural-diagnosis approach to layout debugging that a generic chatbot cannot replicate;</w:t>
+        <w:spacing w:after="80"/>
+      </w:pPr>
+      <w:r>
+        <w:rPr>
+          <w:rFonts w:ascii="Times New Roman" w:cs="Times New Roman" w:eastAsia="Times New Roman" w:hAnsi="Times New Roman"/>
+          <w:sz w:val="22"/>
+          <w:szCs w:val="22"/>
+        </w:rPr>
+        <w:t xml:space="preserve">what BorderLayout is, and how its five regions — NORTH, SOUTH, EAST, WEST and CENTER — position components inside a JFrame;</w:t>
       </w:r>
     </w:p>
     <w:p>
@@ -266,15 +282,51 @@
           <w:ilvl w:val="0"/>
           <w:numId w:val="1"/>
         </w:numPr>
-        <w:spacing w:after="100"/>
-      </w:pPr>
-      <w:r>
-        <w:rPr>
-          <w:rFonts w:ascii="Times New Roman" w:cs="Times New Roman" w:eastAsia="Times New Roman" w:hAnsi="Times New Roman"/>
-          <w:sz w:val="22"/>
-          <w:szCs w:val="22"/>
-        </w:rPr>
-        <w:t xml:space="preserve">demonstrate a retrieval-augmented, guarded AI hinting pipeline that explains without ever grading or revealing the answer outright; and</w:t>
+        <w:spacing w:after="80"/>
+      </w:pPr>
+      <w:r>
+        <w:rPr>
+          <w:rFonts w:ascii="Times New Roman" w:cs="Times New Roman" w:eastAsia="Times New Roman" w:hAnsi="Times New Roman"/>
+          <w:sz w:val="22"/>
+          <w:szCs w:val="22"/>
+        </w:rPr>
+        <w:t xml:space="preserve">why adding two components to the same region makes one appear to disappear;</w:t>
+      </w:r>
+    </w:p>
+    <w:p>
+      <w:pPr>
+        <w:pStyle w:val="ListParagraph"/>
+        <w:numPr>
+          <w:ilvl w:val="0"/>
+          <w:numId w:val="1"/>
+        </w:numPr>
+        <w:spacing w:after="80"/>
+      </w:pPr>
+      <w:r>
+        <w:rPr>
+          <w:rFonts w:ascii="Times New Roman" w:cs="Times New Roman" w:eastAsia="Times New Roman" w:hAnsi="Times New Roman"/>
+          <w:sz w:val="22"/>
+          <w:szCs w:val="22"/>
+        </w:rPr>
+        <w:t xml:space="preserve">how JFrame, JButton and JPanel relate to one another, and why nesting a JPanel resolves the collision;</w:t>
+      </w:r>
+    </w:p>
+    <w:p>
+      <w:pPr>
+        <w:pStyle w:val="ListParagraph"/>
+        <w:numPr>
+          <w:ilvl w:val="0"/>
+          <w:numId w:val="1"/>
+        </w:numPr>
+        <w:spacing w:after="80"/>
+      </w:pPr>
+      <w:r>
+        <w:rPr>
+          <w:rFonts w:ascii="Times New Roman" w:cs="Times New Roman" w:eastAsia="Times New Roman" w:hAnsi="Times New Roman"/>
+          <w:sz w:val="22"/>
+          <w:szCs w:val="22"/>
+        </w:rPr>
+        <w:t xml:space="preserve">how to debug a Java GUI layout problem by reasoning about it, instead of guessing; and</w:t>
       </w:r>
     </w:p>
     <w:p>
@@ -292,7 +344,7 @@
           <w:sz w:val="22"/>
           <w:szCs w:val="22"/>
         </w:rPr>
-        <w:t xml:space="preserve">equip CIAST instructor-trainees with a ready-to-adopt, bilingual (EN/BM) teaching aid they can carry into their own TVET classrooms.</w:t>
+        <w:t xml:space="preserve">how an AI tool can support this kind of learning without simply supplying the answer.</w:t>
       </w:r>
     </w:p>
     <w:p>
@@ -321,7 +373,114 @@
           <w:sz w:val="22"/>
           <w:szCs w:val="22"/>
         </w:rPr>
-        <w:t xml:space="preserve">MagikLayout is a browser-based pedagogical sandbox for Java Swing layout managers, built on one deterministic layout engine that faithfully ports the real JDK algorithms for BorderLayout, FlowLayout and GridLayout. It has four surfaces — a free-exploration Playground, a graded Challenges area, a NOSS-aligned AR Lab, and the AI Debugging Studio submitted here as the AI DigiTeach video's teaching vehicle.</w:t>
+        <w:t xml:space="preserve">The innovation is the video's lesson design, built around a consistent, on-screen four-step framework — Investigate → Predict → Reason → Repair — rather than a conventional narrated slide-and-code walkthrough. Mapped to a standard PdP structure:</w:t>
+      </w:r>
+    </w:p>
+    <w:p>
+      <w:pPr>
+        <w:spacing w:after="100"/>
+      </w:pPr>
+      <w:r>
+        <w:rPr>
+          <w:rFonts w:ascii="Times New Roman" w:cs="Times New Roman" w:eastAsia="Times New Roman" w:hAnsi="Times New Roman"/>
+          <w:b/>
+          <w:bCs/>
+          <w:sz w:val="22"/>
+          <w:szCs w:val="22"/>
+        </w:rPr>
+        <w:t xml:space="preserve">Set induksi: </w:t>
+      </w:r>
+      <w:r>
+        <w:rPr>
+          <w:rFonts w:ascii="Times New Roman" w:cs="Times New Roman" w:eastAsia="Times New Roman" w:hAnsi="Times New Roman"/>
+          <w:sz w:val="22"/>
+          <w:szCs w:val="22"/>
+        </w:rPr>
+        <w:t xml:space="preserve">the video opens with the relatable failure itself — “Ever added a button to a Java Swing application, ran the program… and the button mysteriously disappeared?” — before any explanation is given.</w:t>
+      </w:r>
+    </w:p>
+    <w:p>
+      <w:pPr>
+        <w:spacing w:after="100"/>
+      </w:pPr>
+      <w:r>
+        <w:rPr>
+          <w:rFonts w:ascii="Times New Roman" w:cs="Times New Roman" w:eastAsia="Times New Roman" w:hAnsi="Times New Roman"/>
+          <w:b/>
+          <w:bCs/>
+          <w:sz w:val="22"/>
+          <w:szCs w:val="22"/>
+        </w:rPr>
+        <w:t xml:space="preserve">Isi kandungan: </w:t>
+      </w:r>
+      <w:r>
+        <w:rPr>
+          <w:rFonts w:ascii="Times New Roman" w:cs="Times New Roman" w:eastAsia="Times New Roman" w:hAnsi="Times New Roman"/>
+          <w:sz w:val="22"/>
+          <w:szCs w:val="22"/>
+        </w:rPr>
+        <w:t xml:space="preserve">the presenter reproduces the bug live in Eclipse, then explains the five BorderLayout regions and why a second component added to an already-occupied region hides the first.</w:t>
+      </w:r>
+    </w:p>
+    <w:p>
+      <w:pPr>
+        <w:spacing w:after="100"/>
+      </w:pPr>
+      <w:r>
+        <w:rPr>
+          <w:rFonts w:ascii="Times New Roman" w:cs="Times New Roman" w:eastAsia="Times New Roman" w:hAnsi="Times New Roman"/>
+          <w:b/>
+          <w:bCs/>
+          <w:sz w:val="22"/>
+          <w:szCs w:val="22"/>
+        </w:rPr>
+        <w:t xml:space="preserve">Aktiviti pembelajaran: </w:t>
+      </w:r>
+      <w:r>
+        <w:rPr>
+          <w:rFonts w:ascii="Times New Roman" w:cs="Times New Roman" w:eastAsia="Times New Roman" w:hAnsi="Times New Roman"/>
+          <w:sz w:val="22"/>
+          <w:szCs w:val="22"/>
+        </w:rPr>
+        <w:t xml:space="preserve">the presenter switches to MagikLayout, a free browser-based Swing practice tool, opens the matching interactive mission, predicts the fix on screen before applying it, and asks the tool's built-in AI coach for one hint to check that reasoning — the coach responds with a guiding question rather than the finished fix.</w:t>
+      </w:r>
+    </w:p>
+    <w:p>
+      <w:pPr>
+        <w:spacing w:after="200"/>
+      </w:pPr>
+      <w:r>
+        <w:rPr>
+          <w:rFonts w:ascii="Times New Roman" w:cs="Times New Roman" w:eastAsia="Times New Roman" w:hAnsi="Times New Roman"/>
+          <w:b/>
+          <w:bCs/>
+          <w:sz w:val="22"/>
+          <w:szCs w:val="22"/>
+        </w:rPr>
+        <w:t xml:space="preserve">Penutup: </w:t>
+      </w:r>
+      <w:r>
+        <w:rPr>
+          <w:rFonts w:ascii="Times New Roman" w:cs="Times New Roman" w:eastAsia="Times New Roman" w:hAnsi="Times New Roman"/>
+          <w:sz w:val="22"/>
+          <w:szCs w:val="22"/>
+        </w:rPr>
+        <w:t xml:space="preserve">the presenter nests the second button in a JPanel to resolve the collision, then closes on the video's stated purpose — “The goal isn't just to make the program work. It's to understand why it works” — with an invitation to try the same missions independently.</w:t>
+      </w:r>
+    </w:p>
+    <w:p>
+      <w:pPr>
+        <w:spacing w:after="120" w:before="240"/>
+      </w:pPr>
+      <w:r>
+        <w:rPr>
+          <w:rFonts w:ascii="Times New Roman" w:cs="Times New Roman" w:eastAsia="Times New Roman" w:hAnsi="Times New Roman"/>
+          <w:b/>
+          <w:bCs/>
+          <w:sz w:val="22"/>
+          <w:szCs w:val="22"/>
+        </w:rPr>
+        <w:t xml:space="preserve">4. Methodology / Development Process</w:t>
       </w:r>
     </w:p>
     <w:p>
@@ -335,17 +494,7 @@
           <w:sz w:val="22"/>
           <w:szCs w:val="22"/>
         </w:rPr>
-        <w:t xml:space="preserve">The AI Debugging Studio (route #/classroom) presents twelve repair missions spanning BorderLayout collisions, FlowLayout ordering, GridLayout dimensions, and nested-panel reasoning. In each mission the learner sees a broken interface, predicts the cause before any hint is given, repairs the component structure, and may request one bilingual, source-grounded hint. The product rule governing every hint is stated plainly to learners and instructors alike: </w:t>
-      </w:r>
-      <w:r>
-        <w:rPr>
-          <w:rFonts w:ascii="Times New Roman" w:cs="Times New Roman" w:eastAsia="Times New Roman" w:hAnsi="Times New Roman"/>
-          <w:i/>
-          <w:iCs/>
-          <w:sz w:val="22"/>
-          <w:szCs w:val="22"/>
-        </w:rPr>
-        <w:t xml:space="preserve">“The engine judges. Retrieval grounds. Haiku explains. The guard controls delivery.”</w:t>
+        <w:t xml:space="preserve">Production followed three stages. In pre-production, the lesson was storyboarded around the Investigate-Predict-Reason-Repair sequence, choosing one narrow, high-frequency misconception rather than a broad tour of BorderLayout. In production, two live environments were screen-recorded rather than staged: Eclipse, to reproduce the real bug exactly as a learner would encounter it, and MagikLayout's interactive mission, to show the predict-then-verify step and the single AI hint exchange in real time. Narration is bilingual in delivery — spoken English with Bahasa Malaysia phrasing woven into the explanation — matching the course's own bilingual classroom practice. In post-production, captions, on-screen labels for each region, and the closing call-to-action were added.</w:t>
       </w:r>
     </w:p>
     <w:p>
@@ -359,104 +508,7 @@
           <w:sz w:val="22"/>
           <w:szCs w:val="22"/>
         </w:rPr>
-        <w:t xml:space="preserve">An evidence drawer makes this pipeline inspectable in real time — retrieved chunk ids, the cited source, guard status, model/corpus version and latency are all shown alongside the repair, so an instructor can audit exactly what the AI did and did not do.</w:t>
-      </w:r>
-    </w:p>
-    <w:p>
-      <w:pPr>
-        <w:spacing w:after="120" w:before="240"/>
-      </w:pPr>
-      <w:r>
-        <w:rPr>
-          <w:rFonts w:ascii="Times New Roman" w:cs="Times New Roman" w:eastAsia="Times New Roman" w:hAnsi="Times New Roman"/>
-          <w:b/>
-          <w:bCs/>
-          <w:sz w:val="22"/>
-          <w:szCs w:val="22"/>
-        </w:rPr>
-        <w:t xml:space="preserve">4. Methodology / Development Process</w:t>
-      </w:r>
-    </w:p>
-    <w:p>
-      <w:pPr>
-        <w:spacing w:after="160" w:line="276"/>
-        <w:jc w:val="both"/>
-      </w:pPr>
-      <w:r>
-        <w:rPr>
-          <w:rFonts w:ascii="Times New Roman" w:cs="Times New Roman" w:eastAsia="Times New Roman" w:hAnsi="Times New Roman"/>
-          <w:sz w:val="22"/>
-          <w:szCs w:val="22"/>
-        </w:rPr>
-        <w:t xml:space="preserve">MagikLayout is implemented in React 19 and TypeScript, built with Vite, with zero UI or state-management dependencies beyond React itself. The AI Debugging Studio's coach follows a fixed six-stage pipeline: </w:t>
-      </w:r>
-      <w:r>
-        <w:rPr>
-          <w:rFonts w:ascii="Times New Roman" w:cs="Times New Roman" w:eastAsia="Times New Roman" w:hAnsi="Times New Roman"/>
-          <w:b/>
-          <w:bCs/>
-          <w:sz w:val="22"/>
-          <w:szCs w:val="22"/>
-        </w:rPr>
-        <w:t xml:space="preserve">Observe → Diagnose → Retrieve → Compose → Guard → Log.</w:t>
-      </w:r>
-    </w:p>
-    <w:p>
-      <w:pPr>
-        <w:spacing w:after="160" w:line="276"/>
-        <w:jc w:val="both"/>
-      </w:pPr>
-      <w:r>
-        <w:rPr>
-          <w:rFonts w:ascii="Times New Roman" w:cs="Times New Roman" w:eastAsia="Times New Roman" w:hAnsi="Times New Roman"/>
-          <w:sz w:val="22"/>
-          <w:szCs w:val="22"/>
-        </w:rPr>
-        <w:t xml:space="preserve">A deterministic engine (unchanged by the AI work) grades every repair attempt and maps the result to one of 23 stable misconception codes across 8 families. Retrieval is metadata-first over a versioned, in-repo bilingual corpus of 112 reviewed chunks (56 English/Bahasa Malaysia pairs, corpus v1.0) — retrieval keys off the misconception code the engine already knows, rather than an embedding search, which keeps the system auditable at the corpus's present size. Only when retrieval is confident is Claude Haiku (claude-haiku-4-5) called to compose one short Socratic hint from the retrieved passages, citing only their chunk ids; Haiku never decides correctness, never edits the learner's structure, and never generates the authoritative Java. Every model response passes an automated guard that checks citation validity, solution leakage, output language, length, and contradiction with the engine's own finding; a failure silently substitutes reviewed corpus text instead of blocking the lesson.</w:t>
-      </w:r>
-    </w:p>
-    <w:p>
-      <w:pPr>
-        <w:spacing w:after="160" w:line="276"/>
-        <w:jc w:val="both"/>
-      </w:pPr>
-      <w:r>
-        <w:rPr>
-          <w:rFonts w:ascii="Times New Roman" w:cs="Times New Roman" w:eastAsia="Times New Roman" w:hAnsi="Times New Roman"/>
-          <w:sz w:val="22"/>
-          <w:szCs w:val="22"/>
-        </w:rPr>
-        <w:t xml:space="preserve">The video itself was developed through a standard three-stage production process — storyboard and script (pre-production), screen-captured demonstration of a live mission alongside narration (production), and edit/caption pass (post-production) — using the Studio's real, running state throughout, so nothing shown in the video is a mock-up.</w:t>
-      </w:r>
-    </w:p>
-    <w:p>
-      <w:pPr>
-        <w:spacing w:after="160" w:line="276"/>
-        <w:jc w:val="both"/>
-      </w:pPr>
-      <w:r>
-        <w:rPr>
-          <w:rFonts w:ascii="Times New Roman" w:cs="Times New Roman" w:eastAsia="Times New Roman" w:hAnsi="Times New Roman"/>
-          <w:sz w:val="22"/>
-          <w:szCs w:val="22"/>
-        </w:rPr>
-        <w:t xml:space="preserve">Validation is automated rather than anecdotal: an acceptance gate (</w:t>
-      </w:r>
-      <w:r>
-        <w:rPr>
-          <w:rFonts w:ascii="Courier New" w:cs="Courier New" w:eastAsia="Courier New" w:hAnsi="Courier New"/>
-          <w:sz w:val="22"/>
-          <w:szCs w:val="22"/>
-        </w:rPr>
-        <w:t xml:space="preserve">npm run eval:rag</w:t>
-      </w:r>
-      <w:r>
-        <w:rPr>
-          <w:rFonts w:ascii="Times New Roman" w:cs="Times New Roman" w:eastAsia="Times New Roman" w:hAnsi="Times New Roman"/>
-          <w:sz w:val="22"/>
-          <w:szCs w:val="22"/>
-        </w:rPr>
-        <w:t xml:space="preserve">) runs 138 cases — every supported misconception code × hint levels 1–3 × both languages — in two modes. In deterministic mode (AI switched off) the gate reports 100% retrieval precision, 100% top-source accuracy, 100% coverage, 0% contradiction and 0% leakage. In adversarial mode, a composer deliberately engineered to leak Java, invent citations, contradict the engine and answer in the wrong language is run against the same guard; zero of its responses reach a simulated student, because the guard substitutes approved text every time. This proves the AI is bounded even under a hostile composer, not only under normal operation.</w:t>
+        <w:t xml:space="preserve">On the AI integration specifically: the coach used in the video is deliberately constrained to respond with reasoning support — a question or a partial nudge — rather than the completed fix, and it is used exactly once per mission, after the learner has already committed to a prediction. This ordering (predict, then ask) is the pedagogical choice being demonstrated; the coach's internal implementation is outside the scope of what this video, and this abstract, are evaluated on.</w:t>
       </w:r>
     </w:p>
     <w:p>
@@ -588,7 +640,7 @@
                 <w:sz w:val="20"/>
                 <w:szCs w:val="20"/>
               </w:rPr>
-              <w:t xml:space="preserve">A deterministic structural grader paired with a retrieval-augmented, guarded AI explainer is a different architecture from both drag-and-drop builders and unrestricted chatbot tutoring: retrieval keys off an engine-verified misconception code rather than an embedding search, so every hint is traceable to a specific, reviewed source.</w:t>
+              <w:t xml:space="preserve">Rather than narrating the rule directly, the lesson dramatizes debugging itself: the presenter predicts the fix on camera before revealing it, and the AI coach is used to check reasoning, not to supply the answer — a visibly different pattern from a typical narrated code walkthrough or an unrestricted chatbot exchange.</w:t>
             </w:r>
           </w:p>
         </w:tc>
@@ -639,7 +691,7 @@
                 <w:sz w:val="20"/>
                 <w:szCs w:val="20"/>
               </w:rPr>
-              <w:t xml:space="preserve">Learners see the exact broken component tree, predict the cause, repair it, and receive a bounded bilingual hint only when needed — directly targeting the trial-and-compile pattern that slows down Swing learning in this course.</w:t>
+              <w:t xml:space="preserve">The video targets one precise, high-frequency beginner failure, reproduced first as a real bug in Eclipse so learners recognise it as the exact problem in their own code, not an abstract example.</w:t>
             </w:r>
           </w:p>
         </w:tc>
@@ -690,7 +742,7 @@
                 <w:sz w:val="20"/>
                 <w:szCs w:val="20"/>
               </w:rPr>
-              <w:t xml:space="preserve">The Studio, its 12 missions and its bilingual corpus are code and content, not a one-off recording; CIAST instructor-trainees can adopt the same tool, and the corpus-authoring workflow (documented in the project's RAG governance notes) lets any reviewing teacher add new missions or languages without touching the retrieval or guard code.</w:t>
+              <w:t xml:space="preserve">Investigate → Predict → Reason → Repair is a reusable video format, not a one-off recording; the same structure can host future short lessons on FlowLayout, GridLayout, or other recurring GUI misconceptions in this course.</w:t>
             </w:r>
           </w:p>
         </w:tc>
@@ -741,7 +793,7 @@
                 <w:sz w:val="20"/>
                 <w:szCs w:val="20"/>
               </w:rPr>
-              <w:t xml:space="preserve">The tool requires no sign-up, no per-seat licence and no vendor lock-in; deterministic grading and layout rendering run entirely client-side, and the optional AI call is a single short composition per hint, keeping inference cost per lesson low.</w:t>
+              <w:t xml:space="preserve">The video is free to watch on YouTube, and the practice tool it references is free to use with no account or licence — the only software required is Eclipse, which learners already have installed for this course.</w:t>
             </w:r>
           </w:p>
         </w:tc>
@@ -792,7 +844,7 @@
                 <w:sz w:val="20"/>
                 <w:szCs w:val="20"/>
               </w:rPr>
-              <w:t xml:space="preserve">The deterministic learning and grading loop works with AI switched off entirely, so the lesson never depends on network access or model availability during a live class; the reviewed corpus is a versioned artefact a teaching team can maintain long after initial development.</w:t>
+              <w:t xml:space="preserve">The BorderLayout rule being taught does not change between semesters, so the video remains usable across future cohorts of this course without re-recording.</w:t>
             </w:r>
           </w:p>
         </w:tc>
@@ -843,7 +895,7 @@
                 <w:sz w:val="20"/>
                 <w:szCs w:val="20"/>
               </w:rPr>
-              <w:t xml:space="preserve">Because the corpus is metadata-governed rather than tied to a specific classroom deployment, the same missions and guard logic can extend to further TVET institutions, additional layout managers (e.g., GridBagLayout), or additional languages without re-architecting the pipeline.</w:t>
+              <w:t xml:space="preserve">The four-step format is designed to extend into a short series, with each new episode covering one additional GUI misconception using the same predict-then-verify structure.</w:t>
             </w:r>
           </w:p>
         </w:tc>
@@ -880,39 +932,7 @@
           <w:sz w:val="22"/>
           <w:szCs w:val="22"/>
         </w:rPr>
-        <w:t xml:space="preserve">The figures below are reproducible from the project repository by rerunning </w:t>
-      </w:r>
-      <w:r>
-        <w:rPr>
-          <w:rFonts w:ascii="Courier New" w:cs="Courier New" w:eastAsia="Courier New" w:hAnsi="Courier New"/>
-          <w:sz w:val="22"/>
-          <w:szCs w:val="22"/>
-        </w:rPr>
-        <w:t xml:space="preserve">npm test</w:t>
-      </w:r>
-      <w:r>
-        <w:rPr>
-          <w:rFonts w:ascii="Times New Roman" w:cs="Times New Roman" w:eastAsia="Times New Roman" w:hAnsi="Times New Roman"/>
-          <w:sz w:val="22"/>
-          <w:szCs w:val="22"/>
-        </w:rPr>
-        <w:t xml:space="preserve"> and </w:t>
-      </w:r>
-      <w:r>
-        <w:rPr>
-          <w:rFonts w:ascii="Courier New" w:cs="Courier New" w:eastAsia="Courier New" w:hAnsi="Courier New"/>
-          <w:sz w:val="22"/>
-          <w:szCs w:val="22"/>
-        </w:rPr>
-        <w:t xml:space="preserve">npm run eval:rag</w:t>
-      </w:r>
-      <w:r>
-        <w:rPr>
-          <w:rFonts w:ascii="Times New Roman" w:cs="Times New Roman" w:eastAsia="Times New Roman" w:hAnsi="Times New Roman"/>
-          <w:sz w:val="22"/>
-          <w:szCs w:val="22"/>
-        </w:rPr>
-        <w:t xml:space="preserve"> and are reported here as evaluation-gate results, not classroom outcomes. They establish technical acceptance of the AI pipeline; they are deliberately not framed as a learning-gain claim.</w:t>
+        <w:t xml:space="preserve">As this video was published on 21 August 2026, no independent audience or formative-feedback data exists yet at the time of this submission, and none is claimed. The table below instead records what can be verified directly from the published video against the category's own technical specification, and is offered as evidence of specification compliance rather than of a learning outcome.</w:t>
       </w:r>
     </w:p>
     <w:tbl>
@@ -928,15 +948,14 @@
         </w:tblBorders>
       </w:tblPr>
       <w:tblGrid>
-        <w:gridCol w:w="2500"/>
-        <w:gridCol w:w="2000"/>
-        <w:gridCol w:w="2200"/>
-        <w:gridCol w:w="2326"/>
+        <w:gridCol w:w="3300"/>
+        <w:gridCol w:w="2400"/>
+        <w:gridCol w:w="3326"/>
       </w:tblGrid>
       <w:tr>
         <w:tc>
           <w:tcPr>
-            <w:tcW w:type="dxa" w:w="2500"/>
+            <w:tcW w:type="dxa" w:w="3300"/>
             <w:shd w:fill="D9D9D9" w:val="clear"/>
             <w:tcMar>
               <w:top w:type="dxa" w:w="100"/>
@@ -955,13 +974,13 @@
                 <w:sz w:val="20"/>
                 <w:szCs w:val="20"/>
               </w:rPr>
-              <w:t xml:space="preserve">Evidence Item</w:t>
-            </w:r>
-          </w:p>
-        </w:tc>
-        <w:tc>
-          <w:tcPr>
-            <w:tcW w:type="dxa" w:w="2000"/>
+              <w:t xml:space="preserve">Specification</w:t>
+            </w:r>
+          </w:p>
+        </w:tc>
+        <w:tc>
+          <w:tcPr>
+            <w:tcW w:type="dxa" w:w="2400"/>
             <w:shd w:fill="D9D9D9" w:val="clear"/>
             <w:tcMar>
               <w:top w:type="dxa" w:w="100"/>
@@ -980,13 +999,13 @@
                 <w:sz w:val="20"/>
                 <w:szCs w:val="20"/>
               </w:rPr>
-              <w:t xml:space="preserve">Before / Baseline</w:t>
-            </w:r>
-          </w:p>
-        </w:tc>
-        <w:tc>
-          <w:tcPr>
-            <w:tcW w:type="dxa" w:w="2200"/>
+              <w:t xml:space="preserve">AI DigiTeach Requirement</w:t>
+            </w:r>
+          </w:p>
+        </w:tc>
+        <w:tc>
+          <w:tcPr>
+            <w:tcW w:type="dxa" w:w="3326"/>
             <w:shd w:fill="D9D9D9" w:val="clear"/>
             <w:tcMar>
               <w:top w:type="dxa" w:w="100"/>
@@ -1005,32 +1024,7 @@
                 <w:sz w:val="20"/>
                 <w:szCs w:val="20"/>
               </w:rPr>
-              <w:t xml:space="preserve">After / Result</w:t>
-            </w:r>
-          </w:p>
-        </w:tc>
-        <w:tc>
-          <w:tcPr>
-            <w:tcW w:type="dxa" w:w="2326"/>
-            <w:shd w:fill="D9D9D9" w:val="clear"/>
-            <w:tcMar>
-              <w:top w:type="dxa" w:w="100"/>
-              <w:left w:type="dxa" w:w="120"/>
-              <w:bottom w:type="dxa" w:w="100"/>
-              <w:right w:type="dxa" w:w="120"/>
-            </w:tcMar>
-            <w:vAlign w:val="center"/>
-          </w:tcPr>
-          <w:p>
-            <w:r>
-              <w:rPr>
-                <w:rFonts w:ascii="Times New Roman" w:cs="Times New Roman" w:eastAsia="Times New Roman" w:hAnsi="Times New Roman"/>
-                <w:b/>
-                <w:bCs/>
-                <w:sz w:val="20"/>
-                <w:szCs w:val="20"/>
-              </w:rPr>
-              <w:t xml:space="preserve">Interpretation</w:t>
+              <w:t xml:space="preserve">This Video</w:t>
             </w:r>
           </w:p>
         </w:tc>
@@ -1038,92 +1032,67 @@
       <w:tr>
         <w:tc>
           <w:tcPr>
-            <w:tcW w:type="dxa" w:w="2500"/>
-            <w:tcMar>
-              <w:top w:type="dxa" w:w="100"/>
-              <w:left w:type="dxa" w:w="120"/>
-              <w:bottom w:type="dxa" w:w="100"/>
-              <w:right w:type="dxa" w:w="120"/>
-            </w:tcMar>
-            <w:vAlign w:val="top"/>
-          </w:tcPr>
-          <w:p>
-            <w:r>
-              <w:rPr>
-                <w:rFonts w:ascii="Times New Roman" w:cs="Times New Roman" w:eastAsia="Times New Roman" w:hAnsi="Times New Roman"/>
-                <w:sz w:val="20"/>
-                <w:szCs w:val="20"/>
-              </w:rPr>
-              <w:t xml:space="preserve">Retrieval precision (138-case gate, deterministic mode)</w:t>
-            </w:r>
-          </w:p>
-        </w:tc>
-        <w:tc>
-          <w:tcPr>
-            <w:tcW w:type="dxa" w:w="2000"/>
-            <w:tcMar>
-              <w:top w:type="dxa" w:w="100"/>
-              <w:left w:type="dxa" w:w="120"/>
-              <w:bottom w:type="dxa" w:w="100"/>
-              <w:right w:type="dxa" w:w="120"/>
-            </w:tcMar>
-            <w:vAlign w:val="top"/>
-          </w:tcPr>
-          <w:p>
-            <w:r>
-              <w:rPr>
-                <w:rFonts w:ascii="Times New Roman" w:cs="Times New Roman" w:eastAsia="Times New Roman" w:hAnsi="Times New Roman"/>
-                <w:sz w:val="20"/>
-                <w:szCs w:val="20"/>
-              </w:rPr>
-              <w:t xml:space="preserve">No governed retrieval baseline</w:t>
-            </w:r>
-          </w:p>
-        </w:tc>
-        <w:tc>
-          <w:tcPr>
-            <w:tcW w:type="dxa" w:w="2200"/>
-            <w:tcMar>
-              <w:top w:type="dxa" w:w="100"/>
-              <w:left w:type="dxa" w:w="120"/>
-              <w:bottom w:type="dxa" w:w="100"/>
-              <w:right w:type="dxa" w:w="120"/>
-            </w:tcMar>
-            <w:vAlign w:val="top"/>
-          </w:tcPr>
-          <w:p>
-            <w:r>
-              <w:rPr>
-                <w:rFonts w:ascii="Times New Roman" w:cs="Times New Roman" w:eastAsia="Times New Roman" w:hAnsi="Times New Roman"/>
-                <w:sz w:val="20"/>
-                <w:szCs w:val="20"/>
-              </w:rPr>
-              <w:t xml:space="preserve">100%</w:t>
-            </w:r>
-          </w:p>
-        </w:tc>
-        <w:tc>
-          <w:tcPr>
-            <w:tcW w:type="dxa" w:w="2326"/>
-            <w:tcMar>
-              <w:top w:type="dxa" w:w="100"/>
-              <w:left w:type="dxa" w:w="120"/>
-              <w:bottom w:type="dxa" w:w="100"/>
-              <w:right w:type="dxa" w:w="120"/>
-            </w:tcMar>
-            <w:vAlign w:val="top"/>
-          </w:tcPr>
-          <w:p>
-            <w:pPr>
-              <w:jc w:val="both"/>
-            </w:pPr>
-            <w:r>
-              <w:rPr>
-                <w:rFonts w:ascii="Times New Roman" w:cs="Times New Roman" w:eastAsia="Times New Roman" w:hAnsi="Times New Roman"/>
-                <w:sz w:val="20"/>
-                <w:szCs w:val="20"/>
-              </w:rPr>
-              <w:t xml:space="preserve">Every supported misconception retrieves at least one approved, correctly matched source.</w:t>
+            <w:tcW w:type="dxa" w:w="3300"/>
+            <w:tcMar>
+              <w:top w:type="dxa" w:w="100"/>
+              <w:left w:type="dxa" w:w="120"/>
+              <w:bottom w:type="dxa" w:w="100"/>
+              <w:right w:type="dxa" w:w="120"/>
+            </w:tcMar>
+            <w:vAlign w:val="top"/>
+          </w:tcPr>
+          <w:p>
+            <w:r>
+              <w:rPr>
+                <w:rFonts w:ascii="Times New Roman" w:cs="Times New Roman" w:eastAsia="Times New Roman" w:hAnsi="Times New Roman"/>
+                <w:sz w:val="20"/>
+                <w:szCs w:val="20"/>
+              </w:rPr>
+              <w:t xml:space="preserve">Duration</w:t>
+            </w:r>
+          </w:p>
+        </w:tc>
+        <w:tc>
+          <w:tcPr>
+            <w:tcW w:type="dxa" w:w="2400"/>
+            <w:tcMar>
+              <w:top w:type="dxa" w:w="100"/>
+              <w:left w:type="dxa" w:w="120"/>
+              <w:bottom w:type="dxa" w:w="100"/>
+              <w:right w:type="dxa" w:w="120"/>
+            </w:tcMar>
+            <w:vAlign w:val="top"/>
+          </w:tcPr>
+          <w:p>
+            <w:r>
+              <w:rPr>
+                <w:rFonts w:ascii="Times New Roman" w:cs="Times New Roman" w:eastAsia="Times New Roman" w:hAnsi="Times New Roman"/>
+                <w:sz w:val="20"/>
+                <w:szCs w:val="20"/>
+              </w:rPr>
+              <w:t xml:space="preserve">3–5 minutes</w:t>
+            </w:r>
+          </w:p>
+        </w:tc>
+        <w:tc>
+          <w:tcPr>
+            <w:tcW w:type="dxa" w:w="3326"/>
+            <w:tcMar>
+              <w:top w:type="dxa" w:w="100"/>
+              <w:left w:type="dxa" w:w="120"/>
+              <w:bottom w:type="dxa" w:w="100"/>
+              <w:right w:type="dxa" w:w="120"/>
+            </w:tcMar>
+            <w:vAlign w:val="top"/>
+          </w:tcPr>
+          <w:p>
+            <w:r>
+              <w:rPr>
+                <w:rFonts w:ascii="Times New Roman" w:cs="Times New Roman" w:eastAsia="Times New Roman" w:hAnsi="Times New Roman"/>
+                <w:sz w:val="20"/>
+                <w:szCs w:val="20"/>
+              </w:rPr>
+              <w:t xml:space="preserve">4 minutes 58 seconds</w:t>
             </w:r>
           </w:p>
         </w:tc>
@@ -1131,92 +1100,67 @@
       <w:tr>
         <w:tc>
           <w:tcPr>
-            <w:tcW w:type="dxa" w:w="2500"/>
-            <w:tcMar>
-              <w:top w:type="dxa" w:w="100"/>
-              <w:left w:type="dxa" w:w="120"/>
-              <w:bottom w:type="dxa" w:w="100"/>
-              <w:right w:type="dxa" w:w="120"/>
-            </w:tcMar>
-            <w:vAlign w:val="top"/>
-          </w:tcPr>
-          <w:p>
-            <w:r>
-              <w:rPr>
-                <w:rFonts w:ascii="Times New Roman" w:cs="Times New Roman" w:eastAsia="Times New Roman" w:hAnsi="Times New Roman"/>
-                <w:sz w:val="20"/>
-                <w:szCs w:val="20"/>
-              </w:rPr>
-              <w:t xml:space="preserve">Hint contradiction rate (138-case gate)</w:t>
-            </w:r>
-          </w:p>
-        </w:tc>
-        <w:tc>
-          <w:tcPr>
-            <w:tcW w:type="dxa" w:w="2000"/>
-            <w:tcMar>
-              <w:top w:type="dxa" w:w="100"/>
-              <w:left w:type="dxa" w:w="120"/>
-              <w:bottom w:type="dxa" w:w="100"/>
-              <w:right w:type="dxa" w:w="120"/>
-            </w:tcMar>
-            <w:vAlign w:val="top"/>
-          </w:tcPr>
-          <w:p>
-            <w:r>
-              <w:rPr>
-                <w:rFonts w:ascii="Times New Roman" w:cs="Times New Roman" w:eastAsia="Times New Roman" w:hAnsi="Times New Roman"/>
-                <w:sz w:val="20"/>
-                <w:szCs w:val="20"/>
-              </w:rPr>
-              <w:t xml:space="preserve">n/a</w:t>
-            </w:r>
-          </w:p>
-        </w:tc>
-        <w:tc>
-          <w:tcPr>
-            <w:tcW w:type="dxa" w:w="2200"/>
-            <w:tcMar>
-              <w:top w:type="dxa" w:w="100"/>
-              <w:left w:type="dxa" w:w="120"/>
-              <w:bottom w:type="dxa" w:w="100"/>
-              <w:right w:type="dxa" w:w="120"/>
-            </w:tcMar>
-            <w:vAlign w:val="top"/>
-          </w:tcPr>
-          <w:p>
-            <w:r>
-              <w:rPr>
-                <w:rFonts w:ascii="Times New Roman" w:cs="Times New Roman" w:eastAsia="Times New Roman" w:hAnsi="Times New Roman"/>
-                <w:sz w:val="20"/>
-                <w:szCs w:val="20"/>
-              </w:rPr>
-              <w:t xml:space="preserve">0%</w:t>
-            </w:r>
-          </w:p>
-        </w:tc>
-        <w:tc>
-          <w:tcPr>
-            <w:tcW w:type="dxa" w:w="2326"/>
-            <w:tcMar>
-              <w:top w:type="dxa" w:w="100"/>
-              <w:left w:type="dxa" w:w="120"/>
-              <w:bottom w:type="dxa" w:w="100"/>
-              <w:right w:type="dxa" w:w="120"/>
-            </w:tcMar>
-            <w:vAlign w:val="top"/>
-          </w:tcPr>
-          <w:p>
-            <w:pPr>
-              <w:jc w:val="both"/>
-            </w:pPr>
-            <w:r>
-              <w:rPr>
-                <w:rFonts w:ascii="Times New Roman" w:cs="Times New Roman" w:eastAsia="Times New Roman" w:hAnsi="Times New Roman"/>
-                <w:sz w:val="20"/>
-                <w:szCs w:val="20"/>
-              </w:rPr>
-              <w:t xml:space="preserve">No hint composed by the pipeline contradicted the deterministic engine's own finding.</w:t>
+            <w:tcW w:type="dxa" w:w="3300"/>
+            <w:tcMar>
+              <w:top w:type="dxa" w:w="100"/>
+              <w:left w:type="dxa" w:w="120"/>
+              <w:bottom w:type="dxa" w:w="100"/>
+              <w:right w:type="dxa" w:w="120"/>
+            </w:tcMar>
+            <w:vAlign w:val="top"/>
+          </w:tcPr>
+          <w:p>
+            <w:r>
+              <w:rPr>
+                <w:rFonts w:ascii="Times New Roman" w:cs="Times New Roman" w:eastAsia="Times New Roman" w:hAnsi="Times New Roman"/>
+                <w:sz w:val="20"/>
+                <w:szCs w:val="20"/>
+              </w:rPr>
+              <w:t xml:space="preserve">Aspect ratio</w:t>
+            </w:r>
+          </w:p>
+        </w:tc>
+        <w:tc>
+          <w:tcPr>
+            <w:tcW w:type="dxa" w:w="2400"/>
+            <w:tcMar>
+              <w:top w:type="dxa" w:w="100"/>
+              <w:left w:type="dxa" w:w="120"/>
+              <w:bottom w:type="dxa" w:w="100"/>
+              <w:right w:type="dxa" w:w="120"/>
+            </w:tcMar>
+            <w:vAlign w:val="top"/>
+          </w:tcPr>
+          <w:p>
+            <w:r>
+              <w:rPr>
+                <w:rFonts w:ascii="Times New Roman" w:cs="Times New Roman" w:eastAsia="Times New Roman" w:hAnsi="Times New Roman"/>
+                <w:sz w:val="20"/>
+                <w:szCs w:val="20"/>
+              </w:rPr>
+              <w:t xml:space="preserve">Horizontal (16:9)</w:t>
+            </w:r>
+          </w:p>
+        </w:tc>
+        <w:tc>
+          <w:tcPr>
+            <w:tcW w:type="dxa" w:w="3326"/>
+            <w:tcMar>
+              <w:top w:type="dxa" w:w="100"/>
+              <w:left w:type="dxa" w:w="120"/>
+              <w:bottom w:type="dxa" w:w="100"/>
+              <w:right w:type="dxa" w:w="120"/>
+            </w:tcMar>
+            <w:vAlign w:val="top"/>
+          </w:tcPr>
+          <w:p>
+            <w:r>
+              <w:rPr>
+                <w:rFonts w:ascii="Times New Roman" w:cs="Times New Roman" w:eastAsia="Times New Roman" w:hAnsi="Times New Roman"/>
+                <w:sz w:val="20"/>
+                <w:szCs w:val="20"/>
+              </w:rPr>
+              <w:t xml:space="preserve">16:9</w:t>
             </w:r>
           </w:p>
         </w:tc>
@@ -1224,92 +1168,67 @@
       <w:tr>
         <w:tc>
           <w:tcPr>
-            <w:tcW w:type="dxa" w:w="2500"/>
-            <w:tcMar>
-              <w:top w:type="dxa" w:w="100"/>
-              <w:left w:type="dxa" w:w="120"/>
-              <w:bottom w:type="dxa" w:w="100"/>
-              <w:right w:type="dxa" w:w="120"/>
-            </w:tcMar>
-            <w:vAlign w:val="top"/>
-          </w:tcPr>
-          <w:p>
-            <w:r>
-              <w:rPr>
-                <w:rFonts w:ascii="Times New Roman" w:cs="Times New Roman" w:eastAsia="Times New Roman" w:hAnsi="Times New Roman"/>
-                <w:sz w:val="20"/>
-                <w:szCs w:val="20"/>
-              </w:rPr>
-              <w:t xml:space="preserve">Adversarial guard hold rate</w:t>
-            </w:r>
-          </w:p>
-        </w:tc>
-        <w:tc>
-          <w:tcPr>
-            <w:tcW w:type="dxa" w:w="2000"/>
-            <w:tcMar>
-              <w:top w:type="dxa" w:w="100"/>
-              <w:left w:type="dxa" w:w="120"/>
-              <w:bottom w:type="dxa" w:w="100"/>
-              <w:right w:type="dxa" w:w="120"/>
-            </w:tcMar>
-            <w:vAlign w:val="top"/>
-          </w:tcPr>
-          <w:p>
-            <w:r>
-              <w:rPr>
-                <w:rFonts w:ascii="Times New Roman" w:cs="Times New Roman" w:eastAsia="Times New Roman" w:hAnsi="Times New Roman"/>
-                <w:sz w:val="20"/>
-                <w:szCs w:val="20"/>
-              </w:rPr>
-              <w:t xml:space="preserve">n/a (hostile composer, no guard)</w:t>
-            </w:r>
-          </w:p>
-        </w:tc>
-        <w:tc>
-          <w:tcPr>
-            <w:tcW w:type="dxa" w:w="2200"/>
-            <w:tcMar>
-              <w:top w:type="dxa" w:w="100"/>
-              <w:left w:type="dxa" w:w="120"/>
-              <w:bottom w:type="dxa" w:w="100"/>
-              <w:right w:type="dxa" w:w="120"/>
-            </w:tcMar>
-            <w:vAlign w:val="top"/>
-          </w:tcPr>
-          <w:p>
-            <w:r>
-              <w:rPr>
-                <w:rFonts w:ascii="Times New Roman" w:cs="Times New Roman" w:eastAsia="Times New Roman" w:hAnsi="Times New Roman"/>
-                <w:sz w:val="20"/>
-                <w:szCs w:val="20"/>
-              </w:rPr>
-              <w:t xml:space="preserve">100% blocked</w:t>
-            </w:r>
-          </w:p>
-        </w:tc>
-        <w:tc>
-          <w:tcPr>
-            <w:tcW w:type="dxa" w:w="2326"/>
-            <w:tcMar>
-              <w:top w:type="dxa" w:w="100"/>
-              <w:left w:type="dxa" w:w="120"/>
-              <w:bottom w:type="dxa" w:w="100"/>
-              <w:right w:type="dxa" w:w="120"/>
-            </w:tcMar>
-            <w:vAlign w:val="top"/>
-          </w:tcPr>
-          <w:p>
-            <w:pPr>
-              <w:jc w:val="both"/>
-            </w:pPr>
-            <w:r>
-              <w:rPr>
-                <w:rFonts w:ascii="Times New Roman" w:cs="Times New Roman" w:eastAsia="Times New Roman" w:hAnsi="Times New Roman"/>
-                <w:sz w:val="20"/>
-                <w:szCs w:val="20"/>
-              </w:rPr>
-              <w:t xml:space="preserve">A composer designed to leak solutions, fabricate citations and switch language was stopped in every case; approved text was served instead.</w:t>
+            <w:tcW w:type="dxa" w:w="3300"/>
+            <w:tcMar>
+              <w:top w:type="dxa" w:w="100"/>
+              <w:left w:type="dxa" w:w="120"/>
+              <w:bottom w:type="dxa" w:w="100"/>
+              <w:right w:type="dxa" w:w="120"/>
+            </w:tcMar>
+            <w:vAlign w:val="top"/>
+          </w:tcPr>
+          <w:p>
+            <w:r>
+              <w:rPr>
+                <w:rFonts w:ascii="Times New Roman" w:cs="Times New Roman" w:eastAsia="Times New Roman" w:hAnsi="Times New Roman"/>
+                <w:sz w:val="20"/>
+                <w:szCs w:val="20"/>
+              </w:rPr>
+              <w:t xml:space="preserve">Platform / access</w:t>
+            </w:r>
+          </w:p>
+        </w:tc>
+        <w:tc>
+          <w:tcPr>
+            <w:tcW w:type="dxa" w:w="2400"/>
+            <w:tcMar>
+              <w:top w:type="dxa" w:w="100"/>
+              <w:left w:type="dxa" w:w="120"/>
+              <w:bottom w:type="dxa" w:w="100"/>
+              <w:right w:type="dxa" w:w="120"/>
+            </w:tcMar>
+            <w:vAlign w:val="top"/>
+          </w:tcPr>
+          <w:p>
+            <w:r>
+              <w:rPr>
+                <w:rFonts w:ascii="Times New Roman" w:cs="Times New Roman" w:eastAsia="Times New Roman" w:hAnsi="Times New Roman"/>
+                <w:sz w:val="20"/>
+                <w:szCs w:val="20"/>
+              </w:rPr>
+              <w:t xml:space="preserve">Public or Unlisted YouTube</w:t>
+            </w:r>
+          </w:p>
+        </w:tc>
+        <w:tc>
+          <w:tcPr>
+            <w:tcW w:type="dxa" w:w="3326"/>
+            <w:tcMar>
+              <w:top w:type="dxa" w:w="100"/>
+              <w:left w:type="dxa" w:w="120"/>
+              <w:bottom w:type="dxa" w:w="100"/>
+              <w:right w:type="dxa" w:w="120"/>
+            </w:tcMar>
+            <w:vAlign w:val="top"/>
+          </w:tcPr>
+          <w:p>
+            <w:r>
+              <w:rPr>
+                <w:rFonts w:ascii="Times New Roman" w:cs="Times New Roman" w:eastAsia="Times New Roman" w:hAnsi="Times New Roman"/>
+                <w:sz w:val="20"/>
+                <w:szCs w:val="20"/>
+              </w:rPr>
+              <w:t xml:space="preserve">Public YouTube (@MAAA-Dev)</w:t>
             </w:r>
           </w:p>
         </w:tc>
@@ -1317,120 +1236,140 @@
       <w:tr>
         <w:tc>
           <w:tcPr>
-            <w:tcW w:type="dxa" w:w="2500"/>
-            <w:tcMar>
-              <w:top w:type="dxa" w:w="100"/>
-              <w:left w:type="dxa" w:w="120"/>
-              <w:bottom w:type="dxa" w:w="100"/>
-              <w:right w:type="dxa" w:w="120"/>
-            </w:tcMar>
-            <w:vAlign w:val="top"/>
-          </w:tcPr>
-          <w:p>
-            <w:r>
-              <w:rPr>
-                <w:rFonts w:ascii="Times New Roman" w:cs="Times New Roman" w:eastAsia="Times New Roman" w:hAnsi="Times New Roman"/>
-                <w:sz w:val="20"/>
-                <w:szCs w:val="20"/>
-              </w:rPr>
-              <w:t xml:space="preserve">Deterministic fallback coverage</w:t>
-            </w:r>
-          </w:p>
-        </w:tc>
-        <w:tc>
-          <w:tcPr>
-            <w:tcW w:type="dxa" w:w="2000"/>
-            <w:tcMar>
-              <w:top w:type="dxa" w:w="100"/>
-              <w:left w:type="dxa" w:w="120"/>
-              <w:bottom w:type="dxa" w:w="100"/>
-              <w:right w:type="dxa" w:w="120"/>
-            </w:tcMar>
-            <w:vAlign w:val="top"/>
-          </w:tcPr>
-          <w:p>
-            <w:r>
-              <w:rPr>
-                <w:rFonts w:ascii="Times New Roman" w:cs="Times New Roman" w:eastAsia="Times New Roman" w:hAnsi="Times New Roman"/>
-                <w:sz w:val="20"/>
-                <w:szCs w:val="20"/>
-              </w:rPr>
-              <w:t xml:space="preserve">n/a</w:t>
-            </w:r>
-          </w:p>
-        </w:tc>
-        <w:tc>
-          <w:tcPr>
-            <w:tcW w:type="dxa" w:w="2200"/>
-            <w:tcMar>
-              <w:top w:type="dxa" w:w="100"/>
-              <w:left w:type="dxa" w:w="120"/>
-              <w:bottom w:type="dxa" w:w="100"/>
-              <w:right w:type="dxa" w:w="120"/>
-            </w:tcMar>
-            <w:vAlign w:val="top"/>
-          </w:tcPr>
-          <w:p>
-            <w:r>
-              <w:rPr>
-                <w:rFonts w:ascii="Times New Roman" w:cs="Times New Roman" w:eastAsia="Times New Roman" w:hAnsi="Times New Roman"/>
-                <w:sz w:val="20"/>
-                <w:szCs w:val="20"/>
-              </w:rPr>
-              <w:t xml:space="preserve">100% of lesson flow</w:t>
-            </w:r>
-          </w:p>
-        </w:tc>
-        <w:tc>
-          <w:tcPr>
-            <w:tcW w:type="dxa" w:w="2326"/>
-            <w:tcMar>
-              <w:top w:type="dxa" w:w="100"/>
-              <w:left w:type="dxa" w:w="120"/>
-              <w:bottom w:type="dxa" w:w="100"/>
-              <w:right w:type="dxa" w:w="120"/>
-            </w:tcMar>
-            <w:vAlign w:val="top"/>
-          </w:tcPr>
-          <w:p>
-            <w:pPr>
-              <w:jc w:val="both"/>
-            </w:pPr>
-            <w:r>
-              <w:rPr>
-                <w:rFonts w:ascii="Times New Roman" w:cs="Times New Roman" w:eastAsia="Times New Roman" w:hAnsi="Times New Roman"/>
-                <w:sz w:val="20"/>
-                <w:szCs w:val="20"/>
-              </w:rPr>
-              <w:t xml:space="preserve">The repair-and-grade loop is verified to work correctly with the AI layer disabled entirely.</w:t>
+            <w:tcW w:type="dxa" w:w="3300"/>
+            <w:tcMar>
+              <w:top w:type="dxa" w:w="100"/>
+              <w:left w:type="dxa" w:w="120"/>
+              <w:bottom w:type="dxa" w:w="100"/>
+              <w:right w:type="dxa" w:w="120"/>
+            </w:tcMar>
+            <w:vAlign w:val="top"/>
+          </w:tcPr>
+          <w:p>
+            <w:r>
+              <w:rPr>
+                <w:rFonts w:ascii="Times New Roman" w:cs="Times New Roman" w:eastAsia="Times New Roman" w:hAnsi="Times New Roman"/>
+                <w:sz w:val="20"/>
+                <w:szCs w:val="20"/>
+              </w:rPr>
+              <w:t xml:space="preserve">Lesson design</w:t>
+            </w:r>
+          </w:p>
+        </w:tc>
+        <w:tc>
+          <w:tcPr>
+            <w:tcW w:type="dxa" w:w="2400"/>
+            <w:tcMar>
+              <w:top w:type="dxa" w:w="100"/>
+              <w:left w:type="dxa" w:w="120"/>
+              <w:bottom w:type="dxa" w:w="100"/>
+              <w:right w:type="dxa" w:w="120"/>
+            </w:tcMar>
+            <w:vAlign w:val="top"/>
+          </w:tcPr>
+          <w:p>
+            <w:r>
+              <w:rPr>
+                <w:rFonts w:ascii="Times New Roman" w:cs="Times New Roman" w:eastAsia="Times New Roman" w:hAnsi="Times New Roman"/>
+                <w:sz w:val="20"/>
+                <w:szCs w:val="20"/>
+              </w:rPr>
+              <w:t xml:space="preserve">Set induksi, isi kandungan, aktiviti pembelajaran, penutup</w:t>
+            </w:r>
+          </w:p>
+        </w:tc>
+        <w:tc>
+          <w:tcPr>
+            <w:tcW w:type="dxa" w:w="3326"/>
+            <w:tcMar>
+              <w:top w:type="dxa" w:w="100"/>
+              <w:left w:type="dxa" w:w="120"/>
+              <w:bottom w:type="dxa" w:w="100"/>
+              <w:right w:type="dxa" w:w="120"/>
+            </w:tcMar>
+            <w:vAlign w:val="top"/>
+          </w:tcPr>
+          <w:p>
+            <w:r>
+              <w:rPr>
+                <w:rFonts w:ascii="Times New Roman" w:cs="Times New Roman" w:eastAsia="Times New Roman" w:hAnsi="Times New Roman"/>
+                <w:sz w:val="20"/>
+                <w:szCs w:val="20"/>
+              </w:rPr>
+              <w:t xml:space="preserve">Present — see Section 3</w:t>
+            </w:r>
+          </w:p>
+        </w:tc>
+      </w:tr>
+      <w:tr>
+        <w:tc>
+          <w:tcPr>
+            <w:tcW w:type="dxa" w:w="3300"/>
+            <w:tcMar>
+              <w:top w:type="dxa" w:w="100"/>
+              <w:left w:type="dxa" w:w="120"/>
+              <w:bottom w:type="dxa" w:w="100"/>
+              <w:right w:type="dxa" w:w="120"/>
+            </w:tcMar>
+            <w:vAlign w:val="top"/>
+          </w:tcPr>
+          <w:p>
+            <w:r>
+              <w:rPr>
+                <w:rFonts w:ascii="Times New Roman" w:cs="Times New Roman" w:eastAsia="Times New Roman" w:hAnsi="Times New Roman"/>
+                <w:sz w:val="20"/>
+                <w:szCs w:val="20"/>
+              </w:rPr>
+              <w:t xml:space="preserve">AI integration</w:t>
+            </w:r>
+          </w:p>
+        </w:tc>
+        <w:tc>
+          <w:tcPr>
+            <w:tcW w:type="dxa" w:w="2400"/>
+            <w:tcMar>
+              <w:top w:type="dxa" w:w="100"/>
+              <w:left w:type="dxa" w:w="120"/>
+              <w:bottom w:type="dxa" w:w="100"/>
+              <w:right w:type="dxa" w:w="120"/>
+            </w:tcMar>
+            <w:vAlign w:val="top"/>
+          </w:tcPr>
+          <w:p>
+            <w:r>
+              <w:rPr>
+                <w:rFonts w:ascii="Times New Roman" w:cs="Times New Roman" w:eastAsia="Times New Roman" w:hAnsi="Times New Roman"/>
+                <w:sz w:val="20"/>
+                <w:szCs w:val="20"/>
+              </w:rPr>
+              <w:t xml:space="preserve">Clear, relevant, ethically used</w:t>
+            </w:r>
+          </w:p>
+        </w:tc>
+        <w:tc>
+          <w:tcPr>
+            <w:tcW w:type="dxa" w:w="3326"/>
+            <w:tcMar>
+              <w:top w:type="dxa" w:w="100"/>
+              <w:left w:type="dxa" w:w="120"/>
+              <w:bottom w:type="dxa" w:w="100"/>
+              <w:right w:type="dxa" w:w="120"/>
+            </w:tcMar>
+            <w:vAlign w:val="top"/>
+          </w:tcPr>
+          <w:p>
+            <w:r>
+              <w:rPr>
+                <w:rFonts w:ascii="Times New Roman" w:cs="Times New Roman" w:eastAsia="Times New Roman" w:hAnsi="Times New Roman"/>
+                <w:sz w:val="20"/>
+                <w:szCs w:val="20"/>
+              </w:rPr>
+              <w:t xml:space="preserve">One coach hint per mission, after the learner's own prediction — see Section 4</w:t>
             </w:r>
           </w:p>
         </w:tc>
       </w:tr>
     </w:tbl>
-    <w:p>
-      <w:pPr>
-        <w:spacing w:after="100" w:before="200"/>
-      </w:pPr>
-    </w:p>
-    <w:p>
-      <w:pPr>
-        <w:spacing w:after="160" w:line="276"/>
-        <w:jc w:val="both"/>
-      </w:pPr>
-      <w:r>
-        <w:rPr>
-          <w:rFonts w:ascii="Times New Roman" w:cs="Times New Roman" w:eastAsia="Times New Roman" w:hAnsi="Times New Roman"/>
-          <w:i/>
-          <w:iCs/>
-          <w:sz w:val="22"/>
-          <w:szCs w:val="22"/>
-          <w:highlight w:val="yellow"/>
-          <w:highlightCs w:val="yellow"/>
-        </w:rPr>
-        <w:t xml:space="preserve">[Insert instructor-trainee formative feedback here if a small-group trial was run before submission, e.g., number of trainees, task completion time, or a short quote — otherwise state plainly that only technical/evaluation-gate evidence is available at submission time, consistent with the honesty framing above.]</w:t>
-      </w:r>
-    </w:p>
     <w:p>
       <w:pPr>
         <w:spacing w:after="120" w:before="240"/>
@@ -1560,7 +1499,7 @@
                 <w:sz w:val="20"/>
                 <w:szCs w:val="20"/>
               </w:rPr>
-              <w:t xml:space="preserve">Structural, source-cited feedback replaces trial-and-compile guessing; the evidence drawer gives instructor-trainees a concrete example of AI-assisted formative feedback they can later reproduce in their own teaching.</w:t>
+              <w:t xml:space="preserve">Models predict-before-verify reasoning for a specific, high-frequency misconception, giving learners a repeatable habit — investigate, predict, reason, repair — they can apply to layout problems the video does not cover.</w:t>
             </w:r>
           </w:p>
         </w:tc>
@@ -1611,7 +1550,7 @@
                 <w:sz w:val="20"/>
                 <w:szCs w:val="20"/>
               </w:rPr>
-              <w:t xml:space="preserve">As a ready-made, versioned teaching aid, the Studio can seed CIAST's shared bank of PdP materials (Bank Bahan PdP) referenced in the MIPAC TVET 2026 briefing, reducing the need for each instructor to build equivalent material from scratch.</w:t>
+              <w:t xml:space="preserve">A short, focused, reusable video lowers the cost of covering this misconception in class; the same recording can be assigned as pre-lab viewing in future sessions of this course without repeating the explanation live each time.</w:t>
             </w:r>
           </w:p>
         </w:tc>
@@ -1662,7 +1601,7 @@
                 <w:sz w:val="20"/>
                 <w:szCs w:val="20"/>
               </w:rPr>
-              <w:t xml:space="preserve">Because the corpus and missions are metadata-governed rather than hard-wired to one classroom, the tool is designed to be adapted by other polytechnics and TVET institutions teaching Java GUI programming.</w:t>
+              <w:t xml:space="preserve">Published openly on YouTube, the video is freely shareable with other TVET instructors teaching Java GUI programming, without requiring them to adopt any particular tool.</w:t>
             </w:r>
           </w:p>
         </w:tc>
@@ -1713,7 +1652,7 @@
                 <w:sz w:val="20"/>
                 <w:szCs w:val="20"/>
               </w:rPr>
-              <w:t xml:space="preserve">The application is free to use with no account or API key required; commercialisation has not been pursued and is not claimed at this stage.</w:t>
+              <w:t xml:space="preserve">None claimed; the video and the practice tool it references are both freely accessible.</w:t>
             </w:r>
           </w:p>
         </w:tc>
@@ -1764,7 +1703,7 @@
                 <w:sz w:val="20"/>
                 <w:szCs w:val="20"/>
               </w:rPr>
-              <w:t xml:space="preserve">The project directly supports MIPAC TVET 2026's stated objective of strengthening TVET instructors' digital and AI competency, and models a disclosed, guarded, auditable pattern for using AI in PdP content — rather than an unrestricted chatbot integration.</w:t>
+              <w:t xml:space="preserve">Demonstrates, in a single short lesson, how a TVET instructor can integrate AI into a teaching video ethically and visibly — the AI is shown supporting reasoning, not replacing it — directly supporting MIPAC TVET 2026's objective of strengthening instructors' digital and AI competency.</w:t>
             </w:r>
           </w:p>
         </w:tc>
@@ -1801,7 +1740,7 @@
           <w:sz w:val="22"/>
           <w:szCs w:val="22"/>
         </w:rPr>
-        <w:t xml:space="preserve">MagikLayout's AI Debugging Studio is implemented, provides twelve interactive repair missions, performs runtime retrieval over a governed bilingual corpus, optionally composes hints with Claude Haiku under an automated guard, and grades every repair deterministically. Its acceptance gate reports 100% retrieval precision and zero hint contradictions across 138 evaluation cases, and the deterministic lesson loop is verified to function with the AI layer switched off entirely. It is not yet accurate to claim a measured learning gain, broad institutional adoption, or market leadership, and this abstract makes none of those claims: no classroom pre/post study has been run at the time of submission. The innovation's near-term readiness lies in its technical completeness and its auditability, and its next step toward wider TVET adoption is a small, same-learner pre/post pilot with CIAST instructor-trainees.</w:t>
+        <w:t xml:space="preserve">“Java Swing BorderLayout | Why Did My Button Disappear?” is a complete, published, 4-minute-58-second video lesson that meets the AI DigiTeach technical specification, teaches one specific and common Java Swing misconception, and integrates AI visibly and ethically — as a check on the learner's own reasoning, never as a source of the finished answer. No learning-gain or adoption claim is made at this stage, since the video was published only recently and no audience data yet exists. Its next step is to extend Investigate → Predict → Reason → Repair into a short series covering further Swing layout misconceptions, and to gather learner feedback from future cohorts of this course.</w:t>
       </w:r>
     </w:p>
     <w:p>
@@ -1871,7 +1810,7 @@
           <w:sz w:val="22"/>
           <w:szCs w:val="22"/>
         </w:rPr>
-        <w:t xml:space="preserve">Claude (Anthropic; Sonnet 5 for manuscript and script drafting, and Haiku 4.5 as the in-product composition model) was used in two distinct ways in this submission. First, it assisted in drafting and structuring this manuscript and the accompanying video script; all AI-assisted text was reviewed, checked against the project's technical documentation and evaluation logs, and edited by the author(s) before submission. Second, Claude Haiku is the runtime language model inside the AI Debugging Studio's guarded retrieval pipeline described in Sections 3–4, where it composes short hint text strictly from retrieved, human-reviewed corpus passages and is bounded by an automated citation/leakage/language/contradiction guard; it has no role in grading, in editing the learner's work, or in generating the authoritative Java code shown to learners.</w:t>
+        <w:t xml:space="preserve">Claude (Anthropic, Sonnet 5) was used to assist in drafting and structuring this manuscript. All AI-assisted text was reviewed and edited by the author before submission. Within the video itself, the AI coach shown on screen is constrained to respond with a guiding question or partial nudge rather than the completed fix, and is used only after the presenter has already committed to a prediction, as described in Sections 3–4.</w:t>
       </w:r>
     </w:p>
     <w:p>
@@ -2020,7 +1959,7 @@
           <w:sz w:val="22"/>
           <w:szCs w:val="22"/>
         </w:rPr>
-        <w:t xml:space="preserve">Lewis, P., Perez, E., Piktus, A., Petroni, F., Karpukhin, V., Goyal, N., Küttler, H., Lewis, M., Yih, W., Rocktäschel, T., Riedel, S., &amp; Kiela, D. (2020). Retrieval-augmented generation for knowledge-intensive NLP tasks. Advances in Neural Information Processing Systems, 33, 9459–9474.</w:t>
+        <w:t xml:space="preserve">Anthropic. (2026). Claude (Sonnet 5) [Large language model]. https://www.anthropic.com</w:t>
       </w:r>
     </w:p>
     <w:p>
@@ -2035,7 +1974,7 @@
           <w:sz w:val="22"/>
           <w:szCs w:val="22"/>
         </w:rPr>
-        <w:t xml:space="preserve">Anthropic. (2026). Claude (Sonnet 5 and Haiku 4.5) [Large language models]. https://www.anthropic.com</w:t>
+        <w:t xml:space="preserve">Mohd Azlan Ab Aziz. (2026, August 21). Java Swing BorderLayout | Why did my button disappear? [Video]. YouTube. https://www.youtube.com/watch?v=TlBQcG6UVuE</w:t>
       </w:r>
     </w:p>
     <w:p>
@@ -2053,7 +1992,7 @@
           <w:highlight w:val="yellow"/>
           <w:highlightCs w:val="yellow"/>
         </w:rPr>
-        <w:t xml:space="preserve">[Add course- and TVET-specific literature here, e.g., on Swing/GUI pedagogy or AI-assisted formative feedback, arranged alphabetically per APA 7th edition.]</w:t>
+        <w:t xml:space="preserve">[Add course- or TVET-specific literature here if required, e.g., on GUI pedagogy or predict-then-verify learning, arranged alphabetically per APA 7th edition.]</w:t>
       </w:r>
     </w:p>
     <w:p>
@@ -2084,7 +2023,7 @@
           <w:sz w:val="22"/>
           <w:szCs w:val="22"/>
         </w:rPr>
-        <w:t xml:space="preserve">The course outline PDF could not be opened in this session (a macOS file-permission prompt for the Desktop folder was not granted), so the exact course code, learning outcomes, credit hours and cohort profile are not reflected above. Please confirm/replace the yellow-highlighted placeholders — author name, department, and the two open sections — and drop this note before submitting.</w:t>
+        <w:t xml:space="preserve">Per reviewer feedback, this draft was rewritten to centre on the video itself (its lesson design and production) rather than on MagikLayout's internal architecture — the technical RAG/guard detail from the previous draft has been removed. Department/unit under the author's name is still a placeholder; please confirm it. The course outline PDF could not be opened in the authoring session (a macOS Desktop file-permission prompt was not granted), so exact course code and credit hours are not stated above — add them if the category requires it.</w:t>
       </w:r>
     </w:p>
     <w:sectPr>

</xml_diff>

<commit_message>
Add Veo3 abstract scene and MagikLayout evidence panel to the video
Describes two production enhancements now edited into the video:
- A short Veo3-generated abstract opening sequence visualizing the
  general concept of layout, ahead of the concrete Eclipse bug.
- The MagikLayout evidence panel shown on screen before the AI coach's
  hint, so viewers see what source the answer is grounded in.

Expanded the AI-tool disclosure section to cover all three tools used
(Claude, Veo3, MagikLayout's coach) individually, per the submission
template's disclosure requirement.

Co-Authored-By: Claude Sonnet 5 <noreply@anthropic.com>
</commit_message>
<xml_diff>
--- a/MagikLayout_AI_DigiTeach_Extended_Abstract.docx
+++ b/MagikLayout_AI_DigiTeach_Extended_Abstract.docx
@@ -396,7 +396,7 @@
           <w:sz w:val="22"/>
           <w:szCs w:val="22"/>
         </w:rPr>
-        <w:t xml:space="preserve">the video opens with the relatable failure itself — “Ever added a button to a Java Swing application, ran the program… and the button mysteriously disappeared?” — before any explanation is given.</w:t>
+        <w:t xml:space="preserve">the video opens with the relatable failure itself — “Ever added a button to a Java Swing application, ran the program… and the button mysteriously disappeared?” — before any explanation is given. Immediately after this hook, a short AI-generated abstract sequence, produced with Google's Veo3 text-to-video model, visualizes the general idea of layout itself — shapes seeking a place to belong, one silently displaced by another — before the lesson grounds that abstraction in a concrete, on-screen bug. The sequence depicts no real code or interface; it functions purely as a visual metaphor for the invisible rule the lesson is about to make visible.</w:t>
       </w:r>
     </w:p>
     <w:p>
@@ -442,7 +442,7 @@
           <w:sz w:val="22"/>
           <w:szCs w:val="22"/>
         </w:rPr>
-        <w:t xml:space="preserve">the presenter switches to MagikLayout, a free browser-based Swing practice tool, opens the matching interactive mission, predicts the fix on screen before applying it, and asks the tool's built-in AI coach for one hint to check that reasoning — the coach responds with a guiding question rather than the finished fix.</w:t>
+        <w:t xml:space="preserve">the presenter switches to MagikLayout, a free browser-based Swing practice tool, opens the matching interactive mission, predicts the fix on screen before applying it, and asks the tool's built-in AI coach for one hint to check that reasoning — the coach responds with a guiding question rather than the finished fix. Before the hint text appears, the video also shows MagikLayout's evidence panel on screen: the specific source the coach is drawing its answer from. Viewers see not just what the AI says, but what it is allowed to say, reinforcing on screen the same idea the lesson teaches in words — that the answer should be earned through reasoning, not simply handed over.</w:t>
       </w:r>
     </w:p>
     <w:p>
@@ -494,7 +494,7 @@
           <w:sz w:val="22"/>
           <w:szCs w:val="22"/>
         </w:rPr>
-        <w:t xml:space="preserve">Production followed three stages. In pre-production, the lesson was storyboarded around the Investigate-Predict-Reason-Repair sequence, choosing one narrow, high-frequency misconception rather than a broad tour of BorderLayout. In production, two live environments were screen-recorded rather than staged: Eclipse, to reproduce the real bug exactly as a learner would encounter it, and MagikLayout's interactive mission, to show the predict-then-verify step and the single AI hint exchange in real time. Narration is bilingual in delivery — spoken English with Bahasa Malaysia phrasing woven into the explanation — matching the course's own bilingual classroom practice. In post-production, captions, on-screen labels for each region, and the closing call-to-action were added.</w:t>
+        <w:t xml:space="preserve">Production followed three stages. In pre-production, the lesson was storyboarded around the Investigate-Predict-Reason-Repair sequence, choosing one narrow, high-frequency misconception rather than a broad tour of BorderLayout, and one abstract opening sequence was generated with Google's Veo3 text-to-video model to visualize the concept of layout before the concrete bug is shown. In production, two live environments were screen-recorded rather than staged: Eclipse, to reproduce the real bug exactly as a learner would encounter it, and MagikLayout's interactive mission — including its on-screen evidence panel — to show the predict-then-verify step and the single, source-shown AI hint exchange in real time. Narration is bilingual in delivery — spoken English with Bahasa Malaysia phrasing woven into the explanation — matching the course's own bilingual classroom practice. In post-production, the Veo3 sequence was edited into the opening, alongside captions, on-screen labels for each region, and the closing call-to-action.</w:t>
       </w:r>
     </w:p>
     <w:p>
@@ -1810,7 +1810,79 @@
           <w:sz w:val="22"/>
           <w:szCs w:val="22"/>
         </w:rPr>
-        <w:t xml:space="preserve">Claude (Anthropic, Sonnet 5) was used to assist in drafting and structuring this manuscript. All AI-assisted text was reviewed and edited by the author before submission. Within the video itself, the AI coach shown on screen is constrained to respond with a guiding question or partial nudge rather than the completed fix, and is used only after the presenter has already committed to a prediction, as described in Sections 3–4.</w:t>
+        <w:t xml:space="preserve">Three AI tools were used in this submission, each disclosed separately below.</w:t>
+      </w:r>
+    </w:p>
+    <w:p>
+      <w:pPr>
+        <w:spacing w:after="160" w:line="276"/>
+        <w:jc w:val="both"/>
+      </w:pPr>
+      <w:r>
+        <w:rPr>
+          <w:rFonts w:ascii="Times New Roman" w:cs="Times New Roman" w:eastAsia="Times New Roman" w:hAnsi="Times New Roman"/>
+          <w:b/>
+          <w:bCs/>
+          <w:sz w:val="22"/>
+          <w:szCs w:val="22"/>
+        </w:rPr>
+        <w:t xml:space="preserve">Claude (Anthropic, Sonnet 5). </w:t>
+      </w:r>
+      <w:r>
+        <w:rPr>
+          <w:rFonts w:ascii="Times New Roman" w:cs="Times New Roman" w:eastAsia="Times New Roman" w:hAnsi="Times New Roman"/>
+          <w:sz w:val="22"/>
+          <w:szCs w:val="22"/>
+        </w:rPr>
+        <w:t xml:space="preserve">Used to assist in drafting and structuring this manuscript. All AI-assisted text was reviewed, fact-checked against the published video, and edited by the author before submission.</w:t>
+      </w:r>
+    </w:p>
+    <w:p>
+      <w:pPr>
+        <w:spacing w:after="160" w:line="276"/>
+        <w:jc w:val="both"/>
+      </w:pPr>
+      <w:r>
+        <w:rPr>
+          <w:rFonts w:ascii="Times New Roman" w:cs="Times New Roman" w:eastAsia="Times New Roman" w:hAnsi="Times New Roman"/>
+          <w:b/>
+          <w:bCs/>
+          <w:sz w:val="22"/>
+          <w:szCs w:val="22"/>
+        </w:rPr>
+        <w:t xml:space="preserve">Google Veo3. </w:t>
+      </w:r>
+      <w:r>
+        <w:rPr>
+          <w:rFonts w:ascii="Times New Roman" w:cs="Times New Roman" w:eastAsia="Times New Roman" w:hAnsi="Times New Roman"/>
+          <w:sz w:val="22"/>
+          <w:szCs w:val="22"/>
+        </w:rPr>
+        <w:t xml:space="preserve">Used to generate one short, abstract opening sequence (Section 3, Set induksi) visualizing the general concept of component layout. The sequence depicts no real code, interface, or claim of fact — it is a visual metaphor only — and was reviewed by the author for tone and appropriateness before being edited into the video; no technical verification was required since no factual or technical content is asserted by the sequence.</w:t>
+      </w:r>
+    </w:p>
+    <w:p>
+      <w:pPr>
+        <w:spacing w:after="160" w:line="276"/>
+        <w:jc w:val="both"/>
+      </w:pPr>
+      <w:r>
+        <w:rPr>
+          <w:rFonts w:ascii="Times New Roman" w:cs="Times New Roman" w:eastAsia="Times New Roman" w:hAnsi="Times New Roman"/>
+          <w:b/>
+          <w:bCs/>
+          <w:sz w:val="22"/>
+          <w:szCs w:val="22"/>
+        </w:rPr>
+        <w:t xml:space="preserve">MagikLayout's in-tool AI coach. </w:t>
+      </w:r>
+      <w:r>
+        <w:rPr>
+          <w:rFonts w:ascii="Times New Roman" w:cs="Times New Roman" w:eastAsia="Times New Roman" w:hAnsi="Times New Roman"/>
+          <w:sz w:val="22"/>
+          <w:szCs w:val="22"/>
+        </w:rPr>
+        <w:t xml:space="preserve">Shown in use within the video itself (Section 3, Aktiviti pembelajaran). On screen, it is constrained to respond with a guiding question or partial nudge rather than the completed fix, is used only once, after the presenter has already committed to a prediction, and its evidence panel is shown alongside its answer so viewers can see the source it is drawing from.</w:t>
       </w:r>
     </w:p>
     <w:p>

</xml_diff>